<commit_message>
Manuscript: first-person singular voice
</commit_message>
<xml_diff>
--- a/paper/paper.docx
+++ b/paper/paper.docx
@@ -114,7 +114,7 @@
           <w:sz w:val="22"/>
           <w:szCs w:val="22"/>
         </w:rPr>
-        <w:t xml:space="preserve">When a provider retires the model behind an agent, teams switch to the next model in the same family and ask which of their workflows will break. We answer this question with a pre-registered, repeat-aware audit of six same-family upgrade pairs from four families, including a provider’s two official retirement replacements. Each model ran every task three times on three executable, code-graded testbeds with side effects: a clinical agent on a FHIR health record, an operations agent on six real services, and an MLOps agent that diagnoses production degradation by re-executing pipelines. Mean success rose in 15 of 18 pair–testbed cells and fell significantly in none. Of the tasks a one-shot regression suite flags as broken, 63% (95% CI 50–76%) pass again on re-run. Re-running each failure up to twice removes these false alarms for 20% more episodes, and a first-action probing heuristic did not do better. Reliable regressions (always passed before, always failed after) affect 4.5% of previously reliable tasks, and none survives correction for multiple testing. Unlicensed writes fell significantly in five of six pairs and rose significantly in none. Five of our six hypotheses (five pre-registered, one added by a documented amendment) were not supported, and we report all of them. Finally, a ten-hour outage of the clinical server during our own collection silently corrupted 63% of clinical episodes. On that data, three upgrades appeared to lower success and an official replacement model appeared to reliably break a clinical workflow; checking the environment on every episode removed both artifacts. We release all episodes, serving-provider logs, the per-episode environment check and the analysis code.</w:t>
+        <w:t>When a provider retires the model behind an agent, teams switch to the next model in the same family and ask which of their workflows will break. I answer this question with a pre-registered, repeat-aware audit of six same-family upgrade pairs from four families, including a provider’s two official retirement replacements. Each model ran every task three times on three executable, code-graded testbeds with side effects: a clinical agent on a FHIR health record, an operations agent on six real services, and an MLOps agent that diagnoses production degradation by re-executing pipelines. Mean success rose in 15 of 18 pair–testbed cells and fell significantly in none. Of the tasks a one-shot regression suite flags as broken, 63% (95% CI 50–76%) pass again on re-run. Re-running each failure up to twice removes these false alarms for 20% more episodes, and a first-action probing heuristic did not do better. Reliable regressions (always passed before, always failed after) affect 4.5% of previously reliable tasks, and none survives correction for multiple testing. Unlicensed writes fell significantly in five of six pairs and rose significantly in none. Five of my six hypotheses (five pre-registered, one added by a documented amendment) were not supported, and I report all of them. Finally, a ten-hour outage of the clinical server during my own collection silently corrupted 63% of clinical episodes. On that data, three upgrades appeared to lower success and an official replacement model appeared to reliably break a clinical workflow; checking the environment on every episode removed both artifacts. I release all episodes, serving-provider logs, the per-episode environment check and the analysis code.</w:t>
       </w:r>
     </w:p>
     <w:p>
@@ -197,7 +197,7 @@
           <w:sz w:val="24"/>
           <w:szCs w:val="24"/>
         </w:rPr>
-        <w:t xml:space="preserve">We ask what actually changes when an agent’s model is upgraded to the next version of the same family, and answer with a pre-registered, repeat-aware audit. Six upgrade pairs from four families, including a provider’s two official retirement replacements, run every task three times on three executable testbeds whose grading reads only the resulting state: a clinical agent that reads and writes a FHIR health record (MedAgentBench tasks (Jiang et al. 2025) plus hazard variants), an operations agent acting on real services (PostgreSQL, Gitea, Mailpit, Redis, an S3 store and a ledger database), and an MLOps agent that diagnoses production model degradation by re-executing pipeline components. A within-task permutation test separates </w:t>
+        <w:t xml:space="preserve">I ask what actually changes when an agent’s model is upgraded to the next version of the same family, and answer with a pre-registered, repeat-aware audit. Six upgrade pairs from four families, including a provider’s two official retirement replacements, run every task three times on three executable testbeds whose grading reads only the resulting state: a clinical agent that reads and writes a FHIR health record (MedAgentBench tasks (Jiang et al. 2025) plus hazard variants), an operations agent acting on real services (PostgreSQL, Gitea, Mailpit, Redis, an S3 store and a ledger database), and an MLOps agent that diagnoses production model degradation by re-executing pipeline components. A within-task permutation test separates </w:t>
       </w:r>
       <w:r>
         <w:rPr>
@@ -229,7 +229,7 @@
           <w:sz w:val="24"/>
           <w:szCs w:val="24"/>
         </w:rPr>
-        <w:t xml:space="preserve">Our findings, and contributions, are:</w:t>
+        <w:t>The findings and contributions of this paper are:</w:t>
       </w:r>
     </w:p>
     <w:p>
@@ -258,7 +258,7 @@
           <w:sz w:val="24"/>
           <w:szCs w:val="24"/>
         </w:rPr>
-        <w:t xml:space="preserve"> Of the tasks a single run flags as regressed, 63% (95% CI 50–76%) pass again on re-run. Re-running each failure up to twice before flagging it removes these false alarms for about a fifth more episodes, and a first-action probing heuristic we designed does not beat this simple rule.</w:t>
+        <w:t xml:space="preserve"> Of the tasks a single run flags as regressed, 63% (95% CI 50–76%) pass again on re-run. Re-running each failure up to twice before flagging it removes these false alarms for about a fifth more episodes, and a first-action probing heuristic I designed does not beat this simple rule.</w:t>
       </w:r>
     </w:p>
     <w:p>
@@ -287,7 +287,7 @@
           <w:sz w:val="24"/>
           <w:szCs w:val="24"/>
         </w:rPr>
-        <w:t xml:space="preserve"> Across 18 pair–testbed cells, fewer than one in twenty tasks that the old model always solved is always failed by the new one, and no cell’s count of reliable negative flips survives correction for multiple testing. Same-family upgrades in our sample are better on average and, as far as three runs can tell, not broken in places.</w:t>
+        <w:t xml:space="preserve"> Across 18 pair–testbed cells, fewer than one in twenty tasks that the old model always solved is always failed by the new one, and no cell’s count of reliable negative flips survives correction for multiple testing. Same-family upgrades in my sample are better on average and, as far as three runs can tell, not broken in places.</w:t>
       </w:r>
     </w:p>
     <w:p>
@@ -316,7 +316,7 @@
           <w:sz w:val="24"/>
           <w:szCs w:val="24"/>
         </w:rPr>
-        <w:t xml:space="preserve"> Writes outside the licensed set fall significantly in five of six pairs and rise significantly in none, contrary to the mixed picture our pilot suggested.</w:t>
+        <w:t xml:space="preserve"> Writes outside the licensed set fall significantly in five of six pairs and rise significantly in none, contrary to the mixed picture my pilot suggested.</w:t>
       </w:r>
     </w:p>
     <w:p>
@@ -337,15 +337,15 @@
           <w:sz w:val="24"/>
           <w:szCs w:val="24"/>
         </w:rPr>
-        <w:t xml:space="preserve">A silent environment failure can manufacture every effect we looked for.</w:t>
-      </w:r>
-      <w:r>
-        <w:rPr>
-          <w:rFonts w:ascii="Times New Roman" w:cs="Times New Roman" w:eastAsia="Times New Roman" w:hAnsi="Times New Roman"/>
-          <w:sz w:val="24"/>
-          <w:szCs w:val="24"/>
-        </w:rPr>
-        <w:t xml:space="preserve"> A ten-hour outage of the clinical server during our own collection corrupted 63% of clinical episodes, and 43% of those were still graded as successes, mostly because doing nothing is correct on many conditional tasks. On that data, three upgrades appeared to </w:t>
+        <w:t>A silent environment failure can manufacture every effect I looked for.</w:t>
+      </w:r>
+      <w:r>
+        <w:rPr>
+          <w:rFonts w:ascii="Times New Roman" w:cs="Times New Roman" w:eastAsia="Times New Roman" w:hAnsi="Times New Roman"/>
+          <w:sz w:val="24"/>
+          <w:szCs w:val="24"/>
+        </w:rPr>
+        <w:t xml:space="preserve"> A ten-hour outage of the clinical server during my own collection corrupted 63% of clinical episodes, and 43% of those were still graded as successes, mostly because doing nothing is correct on many conditional tasks. On that data, three upgrades appeared to </w:t>
       </w:r>
       <w:r>
         <w:rPr>
@@ -381,7 +381,7 @@
           <w:sz w:val="24"/>
           <w:szCs w:val="24"/>
         </w:rPr>
-        <w:t xml:space="preserve"> a vital-sign workflow, and reliability appeared to erode; all three disappeared on clean data. We describe how the failure evaded a per-job health check and release the per-episode check and scan that caught it.</w:t>
+        <w:t xml:space="preserve"> a vital-sign workflow, and reliability appeared to erode; all three disappeared on clean data. I describe how the failure evaded a per-job health check and release the per-episode check and scan that caught it.</w:t>
       </w:r>
     </w:p>
     <w:p>
@@ -395,7 +395,7 @@
           <w:sz w:val="24"/>
           <w:szCs w:val="24"/>
         </w:rPr>
-        <w:t xml:space="preserve">All hypotheses, task sets and analysis code were frozen before the confirmatory runs; we report every pre-registered test, including the five of six (one added by amendment) whose criteria were not met, and list every amendment and deviation (Appendix A). Every episode, the serving provider of every call and the analysis code are released.</w:t>
+        <w:t>All hypotheses, task sets and analysis code were frozen before the confirmatory runs; I report every pre-registered test, including the five of six (one added by amendment) whose criteria were not met, and list every amendment and deviation (Appendix A). Every episode, the serving provider of every call and the analysis code are released.</w:t>
       </w:r>
     </w:p>
     <w:p>
@@ -455,7 +455,7 @@
           <w:sz w:val="24"/>
           <w:szCs w:val="24"/>
         </w:rPr>
-        <w:t xml:space="preserve">, instances the old model handled and the new one does not, were defined for image classifiers (Yan et al. 2021) and NLP models (Xie et al. 2021), and reduced through training-time constraints, distillation or gated fusion of old and new predictions (Yan et al. 2021; Lai et al. 2023; Zhu et al. 2024). For large language models, MUSCLE showed that task adapters suffer negative flips when the base model changes (Echterhoff et al. 2024), and API snapshots of the same commercial model were found to drift substantially within months (Chen, Zaharia, and Zou 2024). Two 2026 studies are closest to ours. Cacioli (2026) applies repeated sampling and a reliable-change index to multiple-choice benchmarks and finds that single-shot evaluation misclassifies many items as changed. Sheng and Lu (2026) study sample-level regressions across six same-family upgrade pairs and find that no single signal predicts which samples will regress. Both work with single-turn questions. We study multi-step agents whose failures are actions on real systems, separate reliable flips from run-to-run churn with a permutation test, and classify what kind of action changed.</w:t>
+        <w:t>, instances the old model handled and the new one does not, were defined for image classifiers (Yan et al. 2021) and NLP models (Xie et al. 2021), and reduced through training-time constraints, distillation or gated fusion of old and new predictions (Yan et al. 2021; Lai et al. 2023; Zhu et al. 2024). For large language models, MUSCLE showed that task adapters suffer negative flips when the base model changes (Echterhoff et al. 2024), and API snapshots of the same commercial model were found to drift substantially within months (Chen, Zaharia, and Zou 2024). Two 2026 studies are closest to this work. Cacioli (2026) applies repeated sampling and a reliable-change index to multiple-choice benchmarks and finds that single-shot evaluation misclassifies many items as changed. Sheng and Lu (2026) study sample-level regressions across six same-family upgrade pairs and find that no single signal predicts which samples will regress. Both work with single-turn questions. I study multi-step agents whose failures are actions on real systems, separate reliable flips from run-to-run churn with a permutation test, and classify what kind of action changed.</w:t>
       </w:r>
     </w:p>
     <w:p>
@@ -479,7 +479,7 @@
           <w:sz w:val="24"/>
           <w:szCs w:val="24"/>
         </w:rPr>
-        <w:t xml:space="preserve"> Regression testing of applications built on evolving LLM APIs was argued for by Ma, Yang, and Kästner (2024), and supported by interactive tooling that diffs old and new outputs (Dixit et al. 2024) and by regression suites for code models (Abbassi et al. 2025). Prompt-transfer methods adapt prompts from one model to another (Wang et al. 2025). A mining study of open-source applications found that most migrations off retired models happen after the shutdown date (Kim 2026), and governance proposals call for compatibility gates before updates reach production (Chishti, Oyinloye, and Li 2026). These works motivate our question but do not measure agent-level behaviour under repeated execution.</w:t>
+        <w:t xml:space="preserve"> Regression testing of applications built on evolving LLM APIs was argued for by Ma, Yang, and Kästner (2024), and supported by interactive tooling that diffs old and new outputs (Dixit et al. 2024) and by regression suites for code models (Abbassi et al. 2025). Prompt-transfer methods adapt prompts from one model to another (Wang et al. 2025). A mining study of open-source applications found that most migrations off retired models happen after the shutdown date (Kim 2026), and governance proposals call for compatibility gates before updates reach production (Chishti, Oyinloye, and Li 2026). These works motivate my question but do not measure agent-level behaviour under repeated execution.</w:t>
       </w:r>
     </w:p>
     <w:p>
@@ -528,7 +528,7 @@
           <w:sz w:val="24"/>
           <w:szCs w:val="24"/>
         </w:rPr>
-        <w:t xml:space="preserve"> (Yao et al. 2025), Rabanser et al. (2026) propose a family of reliability metrics, and recent measurements show that tool-call sequences and arguments diverge across identical runs (Yagubyan 2026) and that within-configuration noise can exceed the gap between model versions (Ariño de la Rubia and Pafka 2026). Statistical tools for comparing models efficiently include paired tests for degradation (Kübler et al. 2026), active testing (Kossen et al. 2021) and anytime-valid sequential evaluation (Hsu and Shekhar 2026; Arviv et al. 2026); PACE applies sequential testing to accepting self-modifications of an agent (Shawn 2026). Process-level evaluation of evolving enterprise agent skills across model changes appeared concurrently (Vo, Doshi, and Sheinin 2026); it diagnoses deviations on two skills without old-to-new pairs or noise control. Our contribution is complementary: a repeat-aware audit of real same-family upgrades on three executable testbeds, which quantifies how much of what a one-shot regression suite reports is noise.</w:t>
+        <w:t xml:space="preserve"> (Yao et al. 2025), Rabanser et al. (2026) propose a family of reliability metrics, and recent measurements show that tool-call sequences and arguments diverge across identical runs (Yagubyan 2026) and that within-configuration noise can exceed the gap between model versions (Ariño de la Rubia and Pafka 2026). Statistical tools for comparing models efficiently include paired tests for degradation (Kübler et al. 2026), active testing (Kossen et al. 2021) and anytime-valid sequential evaluation (Hsu and Shekhar 2026; Arviv et al. 2026); PACE applies sequential testing to accepting self-modifications of an agent (Shawn 2026). Process-level evaluation of evolving enterprise agent skills across model changes appeared concurrently (Vo, Doshi, and Sheinin 2026); it diagnoses deviations on two skills without old-to-new pairs or noise control. My contribution is complementary: a repeat-aware audit of real same-family upgrades on three executable testbeds, which quantifies how much of what a one-shot regression suite reports is noise.</w:t>
       </w:r>
     </w:p>
     <w:p>
@@ -552,7 +552,7 @@
           <w:sz w:val="24"/>
           <w:szCs w:val="24"/>
         </w:rPr>
-        <w:t xml:space="preserve"> Agents that act beyond their mandate have been studied as over-authorization in tool calling (Zhang et al. 2026), out-of-scope actions by coding agents (Qu et al. 2026) and scope adherence in offensive-security agents (Caldwell et al. 2026); mitigations derive permissions or policies from the user’s request (Shi et al. 2025). These works compare models at one point in time. We measure how unlicensed side-effecting writes change </w:t>
+        <w:t xml:space="preserve"> Agents that act beyond their mandate have been studied as over-authorization in tool calling (Zhang et al. 2026), out-of-scope actions by coding agents (Qu et al. 2026) and scope adherence in offensive-security agents (Caldwell et al. 2026); mitigations derive permissions or policies from the user’s request (Shi et al. 2025). These works compare models at one point in time. I measure how unlicensed side-effecting writes change </w:t>
       </w:r>
       <w:r>
         <w:rPr>
@@ -638,7 +638,7 @@
           <w:sz w:val="24"/>
           <w:szCs w:val="24"/>
         </w:rPr>
-        <w:t xml:space="preserve"> is an older and a newer model from the same family that a team would plausibly migrate between. We study six pairs from four families (Table 1): two official retirement replacements published by a provider (each older small model is retired in favour of the same newer one), the step between those two older models, and the successive releases of three open-weight families. A seventh, pre-registered pair of two Gemini Flash-Lite versions ran on a free tier as a best-effort addition. Its daily quota of 50 requests per model made it impossible to replace its episodes lost to the outage described in Section 5, so it is excluded from all analyses.</w:t>
+        <w:t xml:space="preserve"> is an older and a newer model from the same family that a team would plausibly migrate between. I study six pairs from four families (Table 1): two official retirement replacements published by a provider (each older small model is retired in favour of the same newer one), the step between those two older models, and the successive releases of three open-weight families. A seventh, pre-registered pair of two Gemini Flash-Lite versions ran on a free tier as a best-effort addition. Its daily quota of 50 requests per model made it impossible to replace its episodes lost to the outage described in Section 5, so it is excluded from all analyses.</w:t>
       </w:r>
     </w:p>
     <w:p>
@@ -2222,7 +2222,7 @@
           <w:sz w:val="24"/>
           <w:szCs w:val="24"/>
         </w:rPr>
-        <w:t xml:space="preserve"> runs are exchangeable between the two models, we permute the run labels within each task (10,000 permutations) and compare the observed RNF count with its permutation distribution (Good 2005). Holm’s correction (Holm 1979) is applied across all pair–testbed cells.</w:t>
+        <w:t xml:space="preserve"> runs are exchangeable between the two models, I permute the run labels within each task (10,000 permutations) and compare the observed RNF count with its permutation distribution (Good 2005). Holm’s correction (Holm 1979) is applied across all pair–testbed cells.</w:t>
       </w:r>
     </w:p>
     <w:p>
@@ -3450,7 +3450,7 @@
           <w:sz w:val="24"/>
           <w:szCs w:val="24"/>
         </w:rPr>
-        <w:t xml:space="preserve">A one-shot regression suite runs each task once with the new model and flags every task the old model handled that now fails. In our data that procedure flags 54 tasks across the 18 cells (counting only tasks the old model passed in all three runs, so that the old model’s own flakiness cannot cause the flag). Of these, 34 (63%) pass in at least one of the new model’s next two runs (Figure 2); only 20 fail all three times. The pre-registered test required the lower end of the 95% interval to exceed one half; it equals 0.50, so H1 is formally not supported, but the point estimate and the interval both say that at least half of what a one-shot suite reports is run-to-run noise.</w:t>
+        <w:t>A one-shot regression suite runs each task once with the new model and flags every task the old model handled that now fails. In my data that procedure flags 54 tasks across the 18 cells (counting only tasks the old model passed in all three runs, so that the old model’s own flakiness cannot cause the flag). Of these, 34 (63%) pass in at least one of the new model’s next two runs (Figure 2); only 20 fail all three times. The pre-registered test required the lower end of the 95% interval to exceed one half; it equals 0.50, so H1 is formally not supported, but the point estimate and the interval both say that at least half of what a one-shot suite reports is run-to-run noise.</w:t>
       </w:r>
     </w:p>
     <w:p>
@@ -3464,7 +3464,7 @@
           <w:sz w:val="24"/>
           <w:szCs w:val="24"/>
         </w:rPr>
-        <w:t xml:space="preserve">The rule of re-running each failure up to twice before flagging it finds all 20 reliable flips with no false alarms, at a cost of 88 extra episodes (19.6% more than one shot; H4). As a secondary analysis we pre-registered a first-action probing heuristic: it runs only the new model’s first step on every task, fully checks the tasks whose first action differs from the old model’s usual one plus a small random audit of the rest, and bounds the flips it may have missed. Over 200 random seeds it cost more (670 episodes on average against 537) and missed on average 4.8 of the 20 flips, because many reliable flips begin with the same first action as the old model. Confirming tasks in random order under the probe’s budget (capped at what checking every task costs) found 17 of the 20 on average. The simple rule is the best of the procedures we tried.</w:t>
+        <w:t>The rule of re-running each failure up to twice before flagging it finds all 20 reliable flips with no false alarms, at a cost of 88 extra episodes (19.6% more than one shot; H4). As a secondary analysis I pre-registered a first-action probing heuristic: it runs only the new model’s first step on every task, fully checks the tasks whose first action differs from the old model’s usual one plus a small random audit of the rest, and bounds the flips it may have missed. Over 200 random seeds it cost more (670 episodes on average against 537) and missed on average 4.8 of the 20 flips, because many reliable flips begin with the same first action as the old model. Confirming tasks in random order under the probe’s budget (capped at what checking every task costs) found 17 of the 20 on average. The simple rule is the best of the procedures I tried.</w:t>
       </w:r>
     </w:p>
     <w:p>
@@ -3575,7 +3575,7 @@
           <w:sz w:val="24"/>
           <w:szCs w:val="24"/>
         </w:rPr>
-        <w:t xml:space="preserve">Pooled over cells, 20 of the 449 tasks that an old model always solved are always failed by its successor (4.5%; 95% upper bound 6.8%). Reliable positive flips outnumber them six to one (129). No cell’s RNF count is significant after Holm correction across the 18 cells; the smallest corrected p-value is 0.088 (Gemma on the clinical testbed, 4 RNF where 0.75 are expected under exchangeability). Five cells are below 0.05 before correction: Gemma and Qwen on the clinical testbed (4 RNF each), Gemma and Mistral on MLOps (3 and 2), and Mistral on the clinical testbed (2). Several of these concentrate on one task template. Three of Qwen3.5’s four clinical RNFs are instances of one template (report the last HbA1c value and its date, and order a new test if it is older than a year; 12 instances in the set), and two of Gemma 4’s four are instances of another (report the most recent capillary blood glucose; 4 instances). A team whose workflow is one of these templates would experience a real regression. But with three runs and 18 cells, our data cannot distinguish them from the churn that repeated runs of a single model produce, and H5, which required such breaks in improving pairs, is not supported.</w:t>
+        <w:t>Pooled over cells, 20 of the 449 tasks that an old model always solved are always failed by its successor (4.5%; 95% upper bound 6.8%). Reliable positive flips outnumber them six to one (129). No cell’s RNF count is significant after Holm correction across the 18 cells; the smallest corrected p-value is 0.088 (Gemma on the clinical testbed, 4 RNF where 0.75 are expected under exchangeability). Five cells are below 0.05 before correction: Gemma and Qwen on the clinical testbed (4 RNF each), Gemma and Mistral on MLOps (3 and 2), and Mistral on the clinical testbed (2). Several of these concentrate on one task template. Three of Qwen3.5’s four clinical RNFs are instances of one template (report the last HbA1c value and its date, and order a new test if it is older than a year; 12 instances in the set), and two of Gemma 4’s four are instances of another (report the most recent capillary blood glucose; 4 instances). A team whose workflow is one of these templates would experience a real regression. But with three runs and 18 cells, my data cannot distinguish them from the churn that repeated runs of a single model produce, and H5, which required such breaks in improving pairs, is not supported.</w:t>
       </w:r>
     </w:p>
     <w:p>
@@ -3789,7 +3789,7 @@
           <w:sz w:val="24"/>
           <w:szCs w:val="24"/>
         </w:rPr>
-        <w:t xml:space="preserve">Repeat-aware evaluation assumes that differences between runs come from the model. Our own study shows how easily that assumption fails. During the confirmatory collection, the clinical record server stopped accepting connections partway through the clinical run and stayed down for roughly ten hours (2026-10-07, about 16:00 UTC, to 2026-10-08, about 01:30 UTC). The environment check at the start of the job had passed, and the harness recorded every tool response verbatim, including </w:t>
+        <w:t xml:space="preserve">Repeat-aware evaluation assumes that differences between runs come from the model. This study itself shows how easily that assumption fails. During the confirmatory collection, the clinical record server stopped accepting connections partway through the clinical run and stayed down for roughly ten hours (2026-10-07, about 16:00 UTC, to 2026-10-08, about 01:30 UTC). The environment check at the start of the job had passed, and the harness recorded every tool response verbatim, including </w:t>
       </w:r>
       <w:r>
         <w:rPr>
@@ -3819,7 +3819,7 @@
           <w:sz w:val="24"/>
           <w:szCs w:val="24"/>
         </w:rPr>
-        <w:t xml:space="preserve">We found the problem only when reading the individual episodes behind the one cell with a significant reliable-negative-flip count in our first analysis (Table 3): the provider’s official replacement model had “reliably” failed to record a blood-pressure reading on five tasks, and on the first one we opened the server had refused the connection in two of the three runs. A pattern scan of every graded tool response (connection refused, failed new connection, exhausted retries, read time-outs, aborted connections) then found </w:t>
+        <w:t xml:space="preserve">I found the problem only when reading the individual episodes behind the one cell with a significant reliable-negative-flip count in my first analysis (Table 3): the provider’s official replacement model had “reliably” failed to record a blood-pressure reading on five tasks, and on the first one I opened the server had refused the connection in two of the three runs. A pattern scan of every graded tool response (connection refused, failed new connection, exhausted retries, read time-outs, aborted connections) then found </w:t>
       </w:r>
       <w:r>
         <w:rPr>
@@ -3851,7 +3851,7 @@
           <w:sz w:val="24"/>
           <w:szCs w:val="24"/>
         </w:rPr>
-        <w:t xml:space="preserve">Our frozen protocol already stated that episodes lost to infrastructure errors are not recorded but re-run. The harness enforced this for errors raised by the model API, but not for errors the environment returned to the agent as ordinary tool output. We quarantined the affected episodes, changed the harness to check the server before every episode and to refuse any episode whose trace contains a connection error, and re-ran them with the same prompts, decoding settings and response cache. All confirmatory results in this paper are computed on the repaired data; the analysis of the contaminated data is kept as an audit record.</w:t>
+        <w:t>The frozen protocol already stated that episodes lost to infrastructure errors are not recorded but re-run. The harness enforced this for errors raised by the model API, but not for errors the environment returned to the agent as ordinary tool output. I quarantined the affected episodes, changed the harness to check the server before every episode and to refuse any episode whose trace contains a connection error, and re-ran them with the same prompts, decoding settings and response cache. All confirmatory results in this paper are computed on the repaired data; the analysis of the contaminated data is kept as an audit record.</w:t>
       </w:r>
     </w:p>
     <w:p>
@@ -3867,15 +3867,15 @@
           <w:sz w:val="24"/>
           <w:szCs w:val="24"/>
         </w:rPr>
-        <w:t xml:space="preserve">What the contaminated data would have told us.</w:t>
-      </w:r>
-      <w:r>
-        <w:rPr>
-          <w:rFonts w:ascii="Times New Roman" w:cs="Times New Roman" w:eastAsia="Times New Roman" w:hAnsi="Times New Roman"/>
-          <w:sz w:val="24"/>
-          <w:szCs w:val="24"/>
-        </w:rPr>
-        <w:t xml:space="preserve"> Table 3 and Figure 4 compare the clinical results computed on the contaminated data, which is what we would have published had we trusted the job-level check, with the results on the repaired data. Three apparent losses became gains. Gemma 3 → Gemma 4 went from a significant </w:t>
+        <w:t>What the contaminated data would have shown.</w:t>
+      </w:r>
+      <w:r>
+        <w:rPr>
+          <w:rFonts w:ascii="Times New Roman" w:cs="Times New Roman" w:eastAsia="Times New Roman" w:hAnsi="Times New Roman"/>
+          <w:sz w:val="24"/>
+          <w:szCs w:val="24"/>
+        </w:rPr>
+        <w:t xml:space="preserve"> Table 3 and Figure 4 compare the clinical results computed on the contaminated data, which is what I would have published had I trusted the job-level check, with the results on the repaired data. Three apparent losses became gains. Gemma 3 → Gemma 4 went from a significant </w:t>
       </w:r>
       <w:r>
         <w:rPr>
@@ -5965,7 +5965,7 @@
           <w:sz w:val="24"/>
           <w:szCs w:val="24"/>
         </w:rPr>
-        <w:t xml:space="preserve">, not per job. Run-to-run variation, the very signal a repeat-aware audit uses, is also what a partial outage produces. We release the scan script and recommend that agent benchmarks report, alongside success rates, the number of episodes rejected for environment errors.</w:t>
+        <w:t>, not per job. Run-to-run variation, the very signal a repeat-aware audit uses, is also what a partial outage produces. I release the scan script and recommend that agent benchmarks report, alongside success rates, the number of episodes rejected for environment errors.</w:t>
       </w:r>
     </w:p>
     <w:p>
@@ -6007,7 +6007,7 @@
           <w:sz w:val="24"/>
           <w:szCs w:val="24"/>
         </w:rPr>
-        <w:t xml:space="preserve"> We study six pairs from four families on 100 clinical tasks, 50 operations tasks and 40 MLOps cases, with three runs per model. This is enough to separate reliable flips from run-to-run churn per cell, but not to estimate small RNF rates precisely; the pooled upper bounds we report are the honest summary. All models are small or “lite” tiers chosen to fit a budget of under ten US dollars of paid inference; larger models may churn less, and our conclusions about noise in one-shot suites apply most directly to the cost-sensitive tiers that teams run at volume.</w:t>
+        <w:t xml:space="preserve"> I study six pairs from four families on 100 clinical tasks, 50 operations tasks and 40 MLOps cases, with three runs per model. This is enough to separate reliable flips from run-to-run churn per cell, but not to estimate small RNF rates precisely; the pooled upper bounds I report are the honest summary. All models are small or “lite” tiers chosen to fit a budget of under ten US dollars of paid inference; larger models may churn less, and my conclusions about noise in one-shot suites apply most directly to the cost-sensitive tiers that teams run at volume.</w:t>
       </w:r>
     </w:p>
     <w:p>
@@ -6044,7 +6044,7 @@
           <w:sz w:val="24"/>
           <w:szCs w:val="24"/>
         </w:rPr>
-        <w:t xml:space="preserve"> a task the new model passes with probability one half is classed as an RNF one time in eight. The permutation test accounts for this, but the definition of “reliable” is still coarse. More runs would sharpen it at linear cost; our released episodes allow any reader to recompute every statistic for </w:t>
+        <w:t xml:space="preserve"> a task the new model passes with probability one half is classed as an RNF one time in eight. The permutation test accounts for this, but the definition of “reliable” is still coarse. More runs would sharpen it at linear cost; the released episodes allow any reader to recompute every statistic for </w:t>
       </w:r>
       <m:oMath>
         <m:r>
@@ -6081,7 +6081,7 @@
           <w:sz w:val="24"/>
           <w:szCs w:val="24"/>
         </w:rPr>
-        <w:t xml:space="preserve"> Each model is pinned to one serving provider with fallbacks disabled, and the provider that answered every call is logged. A different provider, quantisation or decoding stack could change behaviour; for open-weight models our results describe </w:t>
+        <w:t xml:space="preserve"> Each model is pinned to one serving provider with fallbacks disabled, and the provider that answered every call is logged. A different provider, quantisation or decoding stack could change behaviour; for open-weight models my results describe </w:t>
       </w:r>
       <w:r>
         <w:rPr>
@@ -6099,7 +6099,7 @@
           <w:sz w:val="24"/>
           <w:szCs w:val="24"/>
         </w:rPr>
-        <w:t xml:space="preserve">. Temperature-zero decoding is not deterministic on these services, which is precisely the churn we measure, so exact episodes are not reproducible, but every episode we graded is released.</w:t>
+        <w:t>. Temperature-zero decoding is not deterministic on these services, which is precisely the churn I measure, so exact episodes are not reproducible, but every episode I graded is released.</w:t>
       </w:r>
     </w:p>
     <w:p>
@@ -6123,7 +6123,7 @@
           <w:sz w:val="24"/>
           <w:szCs w:val="24"/>
         </w:rPr>
-        <w:t xml:space="preserve"> All three testbeds are code-graded with state-based oracles, which rules out judge error but limits the task types to those whose outcome can be read from a system’s state. The clinical tasks run against a public synthetic record, not real patients; nothing here supports clinical use of any model. The operations and MLOps testbeds are our own constructions on real services and real pipelines, and their task mix shapes absolute success rates.</w:t>
+        <w:t xml:space="preserve"> All three testbeds are code-graded with state-based oracles, which rules out judge error but limits the task types to those whose outcome can be read from a system’s state. The clinical tasks run against a public synthetic record, not real patients; nothing here supports clinical use of any model. The operations and MLOps testbeds are my own constructions on real services and real pipelines, and their task mix shapes absolute success rates.</w:t>
       </w:r>
     </w:p>
     <w:p>
@@ -6147,7 +6147,7 @@
           <w:sz w:val="24"/>
           <w:szCs w:val="24"/>
         </w:rPr>
-        <w:t xml:space="preserve"> A pre-registered seventh pair (Gemini Flash-Lite) ran on a free tier. Its quota of 50 requests per model per day made it impossible to replace the episodes lost to the outage, and it is excluded; our conclusions cover four families.</w:t>
+        <w:t xml:space="preserve"> A pre-registered seventh pair (Gemini Flash-Lite) ran on a free tier. Its quota of 50 requests per model per day made it impossible to replace the episodes lost to the outage, and it is excluded; my conclusions cover four families.</w:t>
       </w:r>
     </w:p>
     <w:p>
@@ -6195,7 +6195,7 @@
           <w:sz w:val="24"/>
           <w:szCs w:val="24"/>
         </w:rPr>
-        <w:t xml:space="preserve"> We study upgrades within a family because that is the migration providers recommend when a model is retired. Cross-family switches are likely to change more, and our pairs do not speak to them.</w:t>
+        <w:t xml:space="preserve"> I study upgrades within a family because that is the migration providers recommend when a model is retired. Cross-family switches are likely to change more, and the pairs studied here do not speak to them.</w:t>
       </w:r>
     </w:p>
     <w:p>
@@ -6219,7 +6219,7 @@
           <w:sz w:val="24"/>
           <w:szCs w:val="24"/>
         </w:rPr>
-        <w:t xml:space="preserve"> We state this in the protocol, treat H6 as exploratory on the clinical testbed, and test it as confirmatory only on the operations and MLOps sets, which had not been analysed when it was written.</w:t>
+        <w:t xml:space="preserve"> I state this in the protocol, treat H6 as exploratory on the clinical testbed, and test it as confirmatory only on the operations and MLOps sets, which had not been analysed when it was written.</w:t>
       </w:r>
     </w:p>
     <w:p>
@@ -6261,7 +6261,7 @@
           <w:sz w:val="24"/>
           <w:szCs w:val="24"/>
         </w:rPr>
-        <w:t xml:space="preserve"> Our results suggest three inexpensive habits for a team about to switch an agent to the next model in its family. First, never act on a single failed run: re-run each failure up to twice and flag only tasks that fail every time. In our data this removes all false alarms from one-shot comparisons for about a fifth more episodes, and the cleverer first-action probing we tried does not do better. Second, check the environment per episode, not per job, and refuse to grade any episode in which a tool returned a connection error; our own per-job check passed while the server was down for ten hours. Third, audit unlicensed writes separately from success. The upgrades we studied mostly reduced them, but this is a property of the pairs we studied rather than a law, and a reduction in overreach is invisible in a success rate that already penalises it.</w:t>
+        <w:t xml:space="preserve"> My results suggest three inexpensive habits for a team about to switch an agent to the next model in its family. First, never act on a single failed run: re-run each failure up to twice and flag only tasks that fail every time. In my data this removes all false alarms from one-shot comparisons for about a fifth more episodes, and the cleverer first-action probing I tried does not do better. Second, check the environment per episode, not per job, and refuse to grade any episode in which a tool returned a connection error; my own per-job check passed while the server was down for ten hours. Third, audit unlicensed writes separately from success. The upgrades I studied mostly reduced them, but this is a property of the pairs I studied rather than a law, and a reduction in overreach is invisible in a success rate that already penalises it.</w:t>
       </w:r>
     </w:p>
     <w:p>
@@ -6285,7 +6285,7 @@
           <w:sz w:val="24"/>
           <w:szCs w:val="24"/>
         </w:rPr>
-        <w:t xml:space="preserve"> We began this study expecting, from our pilot and from work on single-turn benchmarks (Cacioli 2026; Sheng and Lu 2026), that same-family upgrades would be better on average but reliably break specific workflows. On clean data they are better on average, often by a wide margin on the operations testbed, and the reliable breaks we see are few and individually indistinguishable from what three runs of the same model produce. Two caveats keep this from being an all-clear. A handful of cells have more reliable negative flips than chance before correction for multiple testing (for example, two open-weight pairs on the clinical testbed), and a team that depends on one of those tasks experiences a real regression whatever the corrected p-value says. And with three runs per model, a reliable flip is a coarse event; a regression that lowers a task’s success rate from 90% to 40% will usually not appear as one. Teams with a small set of critical workflows should therefore run those workflows many more times than three, which is cheap when the set is small.</w:t>
+        <w:t xml:space="preserve"> I began this study expecting, from my pilot and from work on single-turn benchmarks (Cacioli 2026; Sheng and Lu 2026), that same-family upgrades would be better on average but reliably break specific workflows. On clean data they are better on average, often by a wide margin on the operations testbed, and the reliable breaks I see are few and individually indistinguishable from what three runs of the same model produce. Two caveats keep this from being an all-clear. A handful of cells have more reliable negative flips than chance before correction for multiple testing (for example, two open-weight pairs on the clinical testbed), and a team that depends on one of those tasks experiences a real regression whatever the corrected p-value says. And with three runs per model, a reliable flip is a coarse event; a regression that lowers a task’s success rate from 90% to 40% will usually not appear as one. Teams with a small set of critical workflows should therefore run those workflows many more times than three, which is cheap when the set is small.</w:t>
       </w:r>
     </w:p>
     <w:p>
@@ -6309,7 +6309,7 @@
           <w:sz w:val="24"/>
           <w:szCs w:val="24"/>
         </w:rPr>
-        <w:t xml:space="preserve"> Pre-registration did its job twice here. It forced us to report five unmet hypotheses, one of them (H1) missing its criterion only at the boundary, and its exclusion rule, written before any data existed, told us what to do when we found the outage. It did not prevent us from forming a new hypothesis (H6, reliability erosion) on data we did not yet know was corrupted. The confirmatory test of that hypothesis on the two uncorrupted testbeds failed, as did its exploratory version on the repaired clinical data. We report it as a cautionary example: an amendment is only as sound as the data that motivated it.</w:t>
+        <w:t xml:space="preserve"> Pre-registration did its job twice here. It forced me to report five unmet hypotheses, one of them (H1) missing its criterion only at the boundary, and its exclusion rule, written before any data existed, told me what to do when I found the outage. It did not prevent me from forming a new hypothesis (H6, reliability erosion) on data I did not yet know was corrupted. The confirmatory test of that hypothesis on the two uncorrupted testbeds failed, as did its exploratory version on the repaired clinical data. I report it as a cautionary example: an amendment is only as sound as the data that motivated it.</w:t>
       </w:r>
     </w:p>
     <w:p>
@@ -6341,7 +6341,7 @@
           <w:sz w:val="24"/>
           <w:szCs w:val="24"/>
         </w:rPr>
-        <w:t xml:space="preserve">We audited six same-family model upgrades of tool-using agents on three executable testbeds, three runs per model per task, under a pre-registered protocol. At least half of the regressions a one-shot comparison reports are noise, and re-running failures removes them cheaply. Reliable regressions are rare, and newer generations write without licence less often. The largest effect in our study came not from any model but from a silent environment outage, which, before we caught it, had turned three upgrade gains into apparent losses and produced a “reliable” break in a provider’s official replacement model. For agent evaluation, checking the environment on every episode matters as much as running each episode more than once.</w:t>
+        <w:t>I audited six same-family model upgrades of tool-using agents on three executable testbeds, three runs per model per task, under a pre-registered protocol. At least half of the regressions a one-shot comparison reports are noise, and re-running failures removes them cheaply. Reliable regressions are rare, and newer generations write without licence less often. The largest effect in my study came not from any model but from a silent environment outage, which, before I caught it, had turned three upgrade gains into apparent losses and produced a “reliable” break in a provider’s official replacement model. For agent evaluation, checking the environment on every episode matters as much as running each episode more than once.</w:t>
       </w:r>
     </w:p>
     <w:p>
@@ -7589,7 +7589,7 @@
           <w:sz w:val="24"/>
           <w:szCs w:val="24"/>
         </w:rPr>
-        <w:t xml:space="preserve"> After analysing the clinical confirmatory set, and before computing any flip or erosion statistic on the operations or MLOps data, we added H6, </w:t>
+        <w:t xml:space="preserve"> After analysing the clinical confirmatory set, and before computing any flip or erosion statistic on the operations or MLOps data, I added H6, </w:t>
       </w:r>
       <w:r>
         <w:rPr>
@@ -7777,7 +7777,7 @@
           <w:sz w:val="24"/>
           <w:szCs w:val="24"/>
         </w:rPr>
-        <w:t xml:space="preserve">Before the freeze we ran 60 clinical tasks (disjoint from the confirmatory set) three times with every model. In the pilot, several open-weight pairs showed significant reliable-negative-flip counts while the OpenAI pairs showed none, and unlicensed writes appeared to fall for some families and rise for others. These observations shaped H2, H3 and H5. None of them replicated on the confirmatory set: no cell is significant after correction, and unlicensed writes fall in every pair that changes significantly. We report the pilot to document how the hypotheses were formed, not as evidence.</w:t>
+        <w:t>Before the freeze I ran 60 clinical tasks (disjoint from the confirmatory set) three times with every model. In the pilot, several open-weight pairs showed significant reliable-negative-flip counts while the OpenAI pairs showed none, and unlicensed writes appeared to fall for some families and rise for others. These observations shaped H2, H3 and H5. None of them replicated on the confirmatory set: no cell is significant after correction, and unlicensed writes fall in every pair that changes significantly. I report the pilot to document how the hypotheses were formed, not as evidence.</w:t>
       </w:r>
     </w:p>
     <w:p>

</xml_diff>